<commit_message>
Lab30 con resultados reales de la cámara e informe; limpieza del repo
- Lab30: notebook comentado con las salidas de la ejecución en el portátil,
  camara_app.py sin fuente de respaldo, informe en Word con las medidas,
  capturas, video grabado, errores encontrados y respuestas.
- Se elimina el video de cámara simulada.
- Lab31: textos del notebook e informe ajustados, notebook re-ejecutado y
  nombre en la portada.

Co-Authored-By: Claude Opus 5.5 <noreply@anthropic.com>
Claude-Session: https://claude.ai/code/session_019qsZbWmgXmK4Rsnmru3djN
</commit_message>
<xml_diff>
--- a/Lab31_Video/Informe_Lab31_Video_OpenCV.docx
+++ b/Lab31_Video/Informe_Lab31_Video_OpenCV.docx
@@ -168,7 +168,7 @@
           <w:b w:val="0"/>
           <w:i w:val="0"/>
         </w:rPr>
-        <w:t>______________________________</w:t>
+        <w:t>Karl Luckert German</w:t>
       </w:r>
     </w:p>
     <w:p>
@@ -396,6 +396,9 @@
             <w:shd w:val="clear" w:color="auto" w:fill="1F3A5F"/>
           </w:tcPr>
           <w:p>
+            <w:pPr>
+              <w:keepNext/>
+            </w:pPr>
             <w:r/>
             <w:r>
               <w:rPr>
@@ -413,6 +416,9 @@
             <w:shd w:val="clear" w:color="auto" w:fill="1F3A5F"/>
           </w:tcPr>
           <w:p>
+            <w:pPr>
+              <w:keepNext/>
+            </w:pPr>
             <w:r/>
             <w:r>
               <w:rPr>
@@ -430,6 +436,9 @@
             <w:shd w:val="clear" w:color="auto" w:fill="1F3A5F"/>
           </w:tcPr>
           <w:p>
+            <w:pPr>
+              <w:keepNext/>
+            </w:pPr>
             <w:r/>
             <w:r>
               <w:rPr>
@@ -791,6 +800,9 @@
             <w:shd w:val="clear" w:color="auto" w:fill="1F3A5F"/>
           </w:tcPr>
           <w:p>
+            <w:pPr>
+              <w:keepNext/>
+            </w:pPr>
             <w:r/>
             <w:r>
               <w:rPr>
@@ -808,6 +820,9 @@
             <w:shd w:val="clear" w:color="auto" w:fill="1F3A5F"/>
           </w:tcPr>
           <w:p>
+            <w:pPr>
+              <w:keepNext/>
+            </w:pPr>
             <w:r/>
             <w:r>
               <w:rPr>
@@ -1223,6 +1238,9 @@
             <w:shd w:val="clear" w:color="auto" w:fill="1F3A5F"/>
           </w:tcPr>
           <w:p>
+            <w:pPr>
+              <w:keepNext/>
+            </w:pPr>
             <w:r/>
             <w:r>
               <w:rPr>
@@ -1240,6 +1258,9 @@
             <w:shd w:val="clear" w:color="auto" w:fill="1F3A5F"/>
           </w:tcPr>
           <w:p>
+            <w:pPr>
+              <w:keepNext/>
+            </w:pPr>
             <w:r/>
             <w:r>
               <w:rPr>
@@ -1257,6 +1278,9 @@
             <w:shd w:val="clear" w:color="auto" w:fill="1F3A5F"/>
           </w:tcPr>
           <w:p>
+            <w:pPr>
+              <w:keepNext/>
+            </w:pPr>
             <w:r/>
             <w:r>
               <w:rPr>
@@ -1274,6 +1298,9 @@
             <w:shd w:val="clear" w:color="auto" w:fill="1F3A5F"/>
           </w:tcPr>
           <w:p>
+            <w:pPr>
+              <w:keepNext/>
+            </w:pPr>
             <w:r/>
             <w:r>
               <w:rPr>
@@ -1466,6 +1493,9 @@
             <w:shd w:val="clear" w:color="auto" w:fill="1F3A5F"/>
           </w:tcPr>
           <w:p>
+            <w:pPr>
+              <w:keepNext/>
+            </w:pPr>
             <w:r/>
             <w:r>
               <w:rPr>
@@ -1483,6 +1513,9 @@
             <w:shd w:val="clear" w:color="auto" w:fill="1F3A5F"/>
           </w:tcPr>
           <w:p>
+            <w:pPr>
+              <w:keepNext/>
+            </w:pPr>
             <w:r/>
             <w:r>
               <w:rPr>
@@ -1500,6 +1533,9 @@
             <w:shd w:val="clear" w:color="auto" w:fill="1F3A5F"/>
           </w:tcPr>
           <w:p>
+            <w:pPr>
+              <w:keepNext/>
+            </w:pPr>
             <w:r/>
             <w:r>
               <w:rPr>
@@ -1996,7 +2032,7 @@
           <w:b w:val="0"/>
           <w:i w:val="0"/>
         </w:rPr>
-        <w:t>El script de la guía se implementó en reproductor_video.py con parámetros para cada experimento (--fps, --sleep, --wait, --sin-sleep, --auto) y al final imprime el tiempo real de reproducción. Ese script usa cv2.imshow y se ejecuta en local.</w:t>
+        <w:t>El script de la guía se implementó en reproductor_video.py con parámetros para cada experimento (--fps, --sleep, --wait, --sin-sleep, --auto), muestra el video con cv2.imshow y al final imprime el tiempo real de reproducción.</w:t>
       </w:r>
     </w:p>
     <w:p>
@@ -2005,7 +2041,7 @@
           <w:b w:val="0"/>
           <w:i w:val="0"/>
         </w:rPr>
-        <w:t>En el notebook se usa OpenCV sin interfaz gráfica, por lo que los experimentos se repitieron con el mismo ciclo pero midiendo el tiempo en vez de observarlo: se leyeron 120 fotogramas (≈5 s de video), se aplicó time.sleep(1/fps) y la espera de cv2.waitKey(ms) se reemplazó por una pausa equivalente (con ventana abierta, waitKey sí bloquea ese tiempo). Con eso se calculan los FPS efectivos y la velocidad relativa respecto a los 23.976 FPS reales del archivo (1.0× = velocidad normal, menor que 1 = cámara lenta).</w:t>
+        <w:t>Para cuantificar la velocidad y no quedarse solo con la apreciación visual, en el notebook los experimentos se repitieron con el mismo ciclo midiendo el tiempo: se leyeron 120 fotogramas (≈5 s de video), se aplicó time.sleep(1/fps) y la espera de cv2.waitKey(ms) se reemplazó por una pausa equivalente (con ventana abierta, waitKey sí bloquea ese tiempo). Con eso se calculan los FPS efectivos y la velocidad relativa respecto a los 23.976 FPS reales del archivo (1.0× = velocidad normal, menor que 1 = cámara lenta).</w:t>
       </w:r>
     </w:p>
     <w:p>
@@ -2040,6 +2076,9 @@
             <w:shd w:val="clear" w:color="auto" w:fill="1F3A5F"/>
           </w:tcPr>
           <w:p>
+            <w:pPr>
+              <w:keepNext/>
+            </w:pPr>
             <w:r/>
             <w:r>
               <w:rPr>
@@ -2057,6 +2096,9 @@
             <w:shd w:val="clear" w:color="auto" w:fill="1F3A5F"/>
           </w:tcPr>
           <w:p>
+            <w:pPr>
+              <w:keepNext/>
+            </w:pPr>
             <w:r/>
             <w:r>
               <w:rPr>
@@ -2074,6 +2116,9 @@
             <w:shd w:val="clear" w:color="auto" w:fill="1F3A5F"/>
           </w:tcPr>
           <w:p>
+            <w:pPr>
+              <w:keepNext/>
+            </w:pPr>
             <w:r/>
             <w:r>
               <w:rPr>
@@ -2091,6 +2136,9 @@
             <w:shd w:val="clear" w:color="auto" w:fill="1F3A5F"/>
           </w:tcPr>
           <w:p>
+            <w:pPr>
+              <w:keepNext/>
+            </w:pPr>
             <w:r/>
             <w:r>
               <w:rPr>
@@ -2108,6 +2156,9 @@
             <w:shd w:val="clear" w:color="auto" w:fill="1F3A5F"/>
           </w:tcPr>
           <w:p>
+            <w:pPr>
+              <w:keepNext/>
+            </w:pPr>
             <w:r/>
             <w:r>
               <w:rPr>
@@ -2240,7 +2291,7 @@
               <w:rPr>
                 <w:sz w:val="20"/>
               </w:rPr>
-              <w:t>126.4</w:t>
+              <w:t>126.9</w:t>
             </w:r>
           </w:p>
         </w:tc>
@@ -2317,7 +2368,7 @@
               <w:rPr>
                 <w:sz w:val="20"/>
               </w:rPr>
-              <w:t>92.8</w:t>
+              <w:t>93.2</w:t>
             </w:r>
           </w:p>
         </w:tc>
@@ -2331,7 +2382,7 @@
               <w:rPr>
                 <w:sz w:val="20"/>
               </w:rPr>
-              <w:t>10.8</w:t>
+              <w:t>10.7</w:t>
             </w:r>
           </w:p>
         </w:tc>
@@ -2472,7 +2523,7 @@
               <w:rPr>
                 <w:sz w:val="20"/>
               </w:rPr>
-              <w:t>42.7</w:t>
+              <w:t>42.8</w:t>
             </w:r>
           </w:p>
         </w:tc>
@@ -2500,7 +2551,7 @@
               <w:rPr>
                 <w:sz w:val="20"/>
               </w:rPr>
-              <w:t>0.98×</w:t>
+              <w:t>0.97×</w:t>
             </w:r>
           </w:p>
         </w:tc>
@@ -2937,7 +2988,7 @@
               <w:rPr>
                 <w:sz w:val="20"/>
               </w:rPr>
-              <w:t>25.8</w:t>
+              <w:t>26.3</w:t>
             </w:r>
           </w:p>
         </w:tc>
@@ -2951,7 +3002,7 @@
               <w:rPr>
                 <w:sz w:val="20"/>
               </w:rPr>
-              <w:t>38.7</w:t>
+              <w:t>38.0</w:t>
             </w:r>
           </w:p>
         </w:tc>
@@ -2965,7 +3016,7 @@
               <w:rPr>
                 <w:sz w:val="20"/>
               </w:rPr>
-              <w:t>1.61×</w:t>
+              <w:t>1.58×</w:t>
             </w:r>
           </w:p>
         </w:tc>
@@ -3030,7 +3081,7 @@
               <w:rPr>
                 <w:sz w:val="20"/>
               </w:rPr>
-              <w:t>634.2</w:t>
+              <w:t>643.5</w:t>
             </w:r>
           </w:p>
         </w:tc>
@@ -3045,7 +3096,7 @@
               <w:rPr>
                 <w:sz w:val="20"/>
               </w:rPr>
-              <w:t>≈26×</w:t>
+              <w:t>≈27×</w:t>
             </w:r>
           </w:p>
         </w:tc>
@@ -3092,7 +3143,7 @@
               <w:rPr>
                 <w:sz w:val="20"/>
               </w:rPr>
-              <w:t>43.9</w:t>
+              <w:t>43.8</w:t>
             </w:r>
           </w:p>
         </w:tc>
@@ -3238,7 +3289,7 @@
         <w:pStyle w:val="ListBullet"/>
       </w:pPr>
       <w:r>
-        <w:t>Experimento 6: al simular la tecla q en el fotograma 50, el ciclo se rompió; después de cap.release() isOpened() pasó de True a False y read() devolvió False, lo que confirma que el recurso quedó liberado. En el entorno sin interfaz destroyAllWindows() no está implementado, por eso en el notebook va dentro de un try; en local se ejecuta normalmente.</w:t>
+        <w:t>Experimento 6: cuando el ciclo recibe la tecla q (en el fotograma 50) se rompe antes del final; después de cap.release() isOpened() pasó de True a False y read() devolvió False, lo que confirma que el recurso quedó liberado.</w:t>
       </w:r>
     </w:p>
     <w:p>
@@ -3272,6 +3323,9 @@
             <w:shd w:val="clear" w:color="auto" w:fill="1F3A5F"/>
           </w:tcPr>
           <w:p>
+            <w:pPr>
+              <w:keepNext/>
+            </w:pPr>
             <w:r/>
             <w:r>
               <w:rPr>
@@ -3289,6 +3343,9 @@
             <w:shd w:val="clear" w:color="auto" w:fill="1F3A5F"/>
           </w:tcPr>
           <w:p>
+            <w:pPr>
+              <w:keepNext/>
+            </w:pPr>
             <w:r/>
             <w:r>
               <w:rPr>
@@ -3306,6 +3363,9 @@
             <w:shd w:val="clear" w:color="auto" w:fill="1F3A5F"/>
           </w:tcPr>
           <w:p>
+            <w:pPr>
+              <w:keepNext/>
+            </w:pPr>
             <w:r/>
             <w:r>
               <w:rPr>
@@ -3323,6 +3383,9 @@
             <w:shd w:val="clear" w:color="auto" w:fill="1F3A5F"/>
           </w:tcPr>
           <w:p>
+            <w:pPr>
+              <w:keepNext/>
+            </w:pPr>
             <w:r/>
             <w:r>
               <w:rPr>
@@ -3503,7 +3566,7 @@
               <w:rPr>
                 <w:sz w:val="20"/>
               </w:rPr>
-              <w:t>23.4 FPS (0.98×), casi normal</w:t>
+              <w:t>23.4 FPS (0.97×), casi normal</w:t>
             </w:r>
           </w:p>
         </w:tc>
@@ -3567,7 +3630,7 @@
               <w:rPr>
                 <w:sz w:val="20"/>
               </w:rPr>
-              <w:t>38.7 FPS (1.61×), acelerado</w:t>
+              <w:t>38.0 FPS (1.58×), acelerado</w:t>
             </w:r>
           </w:p>
         </w:tc>
@@ -4141,6 +4204,9 @@
             <w:shd w:val="clear" w:color="auto" w:fill="1F3A5F"/>
           </w:tcPr>
           <w:p>
+            <w:pPr>
+              <w:keepNext/>
+            </w:pPr>
             <w:r/>
             <w:r>
               <w:rPr>
@@ -4158,6 +4224,9 @@
             <w:shd w:val="clear" w:color="auto" w:fill="1F3A5F"/>
           </w:tcPr>
           <w:p>
+            <w:pPr>
+              <w:keepNext/>
+            </w:pPr>
             <w:r/>
             <w:r>
               <w:rPr>
@@ -4175,6 +4244,9 @@
             <w:shd w:val="clear" w:color="auto" w:fill="1F3A5F"/>
           </w:tcPr>
           <w:p>
+            <w:pPr>
+              <w:keepNext/>
+            </w:pPr>
             <w:r/>
             <w:r>
               <w:rPr>
@@ -4192,6 +4264,9 @@
             <w:shd w:val="clear" w:color="auto" w:fill="1F3A5F"/>
           </w:tcPr>
           <w:p>
+            <w:pPr>
+              <w:keepNext/>
+            </w:pPr>
             <w:r/>
             <w:r>
               <w:rPr>
@@ -4555,7 +4630,7 @@
           <w:b w:val="0"/>
           <w:i w:val="0"/>
         </w:rPr>
-        <w:t>En costo: la imagen en gris ocupa la tercera parte de memoria que la original, por lo que cualquier operación posterior procesa tres veces menos datos. La conversión a gris es muy barata (≈0.07 ms por fotograma), mientras que Canny cuesta unas 14 veces más (≈1 ms) porque incluye suavizado, gradientes, supresión de no máximos e histéresis. Aplicado a los 300 fotogramas serían ≈21 ms en gris y ≈300 ms en Canny, sin contar la decodificación del video.</w:t>
+        <w:t>En costo: la imagen en gris ocupa la tercera parte de memoria que la original, por lo que cualquier operación posterior procesa tres veces menos datos. La conversión a gris es muy barata (≈0.07 ms por fotograma), mientras que Canny cuesta unas 14 veces más (≈1 ms) porque incluye suavizado, gradientes, supresión de no máximos e histéresis. Aplicado a los 300 fotogramas serían ≈21 ms en gris y ≈290 ms en Canny, sin contar la decodificación del video.</w:t>
       </w:r>
     </w:p>
     <w:p>
@@ -4601,6 +4676,9 @@
             <w:shd w:val="clear" w:color="auto" w:fill="1F3A5F"/>
           </w:tcPr>
           <w:p>
+            <w:pPr>
+              <w:keepNext/>
+            </w:pPr>
             <w:r/>
             <w:r>
               <w:rPr>
@@ -4618,6 +4696,9 @@
             <w:shd w:val="clear" w:color="auto" w:fill="1F3A5F"/>
           </w:tcPr>
           <w:p>
+            <w:pPr>
+              <w:keepNext/>
+            </w:pPr>
             <w:r/>
             <w:r>
               <w:rPr>
@@ -4635,6 +4716,9 @@
             <w:shd w:val="clear" w:color="auto" w:fill="1F3A5F"/>
           </w:tcPr>
           <w:p>
+            <w:pPr>
+              <w:keepNext/>
+            </w:pPr>
             <w:r/>
             <w:r>
               <w:rPr>
@@ -4652,6 +4736,9 @@
             <w:shd w:val="clear" w:color="auto" w:fill="1F3A5F"/>
           </w:tcPr>
           <w:p>
+            <w:pPr>
+              <w:keepNext/>
+            </w:pPr>
             <w:r/>
             <w:r>
               <w:rPr>
@@ -4669,6 +4756,9 @@
             <w:shd w:val="clear" w:color="auto" w:fill="1F3A5F"/>
           </w:tcPr>
           <w:p>
+            <w:pPr>
+              <w:keepNext/>
+            </w:pPr>
             <w:r/>
             <w:r>
               <w:rPr>
@@ -4686,6 +4776,9 @@
             <w:shd w:val="clear" w:color="auto" w:fill="1F3A5F"/>
           </w:tcPr>
           <w:p>
+            <w:pPr>
+              <w:keepNext/>
+            </w:pPr>
             <w:r/>
             <w:r>
               <w:rPr>
@@ -4703,6 +4796,9 @@
             <w:shd w:val="clear" w:color="auto" w:fill="1F3A5F"/>
           </w:tcPr>
           <w:p>
+            <w:pPr>
+              <w:keepNext/>
+            </w:pPr>
             <w:r/>
             <w:r>
               <w:rPr>
@@ -4785,7 +4881,7 @@
               <w:rPr>
                 <w:sz w:val="20"/>
               </w:rPr>
-              <w:t>0.021 s</w:t>
+              <w:t>0.023 s</w:t>
             </w:r>
           </w:p>
         </w:tc>
@@ -4799,7 +4895,7 @@
               <w:rPr>
                 <w:sz w:val="20"/>
               </w:rPr>
-              <w:t>0.016 s</w:t>
+              <w:t>0.019 s</w:t>
             </w:r>
           </w:p>
         </w:tc>
@@ -4893,7 +4989,7 @@
               <w:rPr>
                 <w:sz w:val="20"/>
               </w:rPr>
-              <w:t>0.059 s</w:t>
+              <w:t>0.080 s</w:t>
             </w:r>
           </w:p>
         </w:tc>
@@ -4908,7 +5004,7 @@
               <w:rPr>
                 <w:sz w:val="20"/>
               </w:rPr>
-              <w:t>0.045 s</w:t>
+              <w:t>0.062 s</w:t>
             </w:r>
           </w:p>
         </w:tc>
@@ -4923,7 +5019,7 @@
               <w:rPr>
                 <w:sz w:val="20"/>
               </w:rPr>
-              <w:t>13.8 ms</w:t>
+              <w:t>16.6 ms</w:t>
             </w:r>
           </w:p>
         </w:tc>
@@ -4998,7 +5094,7 @@
               <w:rPr>
                 <w:sz w:val="20"/>
               </w:rPr>
-              <w:t>0.076 s</w:t>
+              <w:t>0.068 s</w:t>
             </w:r>
           </w:p>
         </w:tc>
@@ -5012,7 +5108,7 @@
               <w:rPr>
                 <w:sz w:val="20"/>
               </w:rPr>
-              <w:t>0.061 s</w:t>
+              <w:t>0.052 s</w:t>
             </w:r>
           </w:p>
         </w:tc>
@@ -5026,7 +5122,7 @@
               <w:rPr>
                 <w:sz w:val="20"/>
               </w:rPr>
-              <w:t>15.3 ms</w:t>
+              <w:t>15.7 ms</w:t>
             </w:r>
           </w:p>
         </w:tc>
@@ -5106,7 +5202,7 @@
               <w:rPr>
                 <w:sz w:val="20"/>
               </w:rPr>
-              <w:t>0.186 s</w:t>
+              <w:t>0.177 s</w:t>
             </w:r>
           </w:p>
         </w:tc>
@@ -5121,7 +5217,7 @@
               <w:rPr>
                 <w:sz w:val="20"/>
               </w:rPr>
-              <w:t>0.148 s</w:t>
+              <w:t>0.138 s</w:t>
             </w:r>
           </w:p>
         </w:tc>
@@ -5136,7 +5232,7 @@
               <w:rPr>
                 <w:sz w:val="20"/>
               </w:rPr>
-              <w:t>38.2 ms</w:t>
+              <w:t>39.0 ms</w:t>
             </w:r>
           </w:p>
         </w:tc>
@@ -5214,7 +5310,7 @@
         <w:pStyle w:val="ListBullet"/>
       </w:pPr>
       <w:r>
-        <w:t>La resolución sí afecta el tiempo: el video grande tiene 16 veces los píxeles del chico y tardó ≈9.1 veces más. No es exactamente proporcional porque hay costos fijos por fotograma (llamadas, manejo del contenedor), que pesan más en videos pequeños.</w:t>
+        <w:t>La resolución sí afecta el tiempo: el video grande tiene 16 veces los píxeles del chico y tardó ≈7.6 veces más. No es exactamente proporcional porque hay costos fijos por fotograma (llamadas, manejo del contenedor), que pesan más en videos pequeños.</w:t>
       </w:r>
     </w:p>
     <w:p>
@@ -5230,7 +5326,7 @@
         <w:pStyle w:val="ListBullet"/>
       </w:pPr>
       <w:r>
-        <w:t>Procesando la misma cantidad de fotogramas, los FPS no cambian el costo: peatones.mp4 (10 FPS) y video.mp4 (23.976 FPS) tienen resolución parecida y tardaron parecido (0.076 s y 0.059 s); la pequeña diferencia va con la resolución algo mayor de peatones.mp4 y con que los primeros fotogramas de video.mp4 son oscuros y fáciles de decodificar, no con los FPS. Donde los FPS sí influyen es en el costo por segundo de video: un segundo de video.mp4 tiene 9.1 millones de píxeles para procesar, frente a 4.4 millones en peatones.mp4. Para procesar en tiempo real hay que cumplir con el presupuesto de 1/FPS por fotograma (41.7 ms a 23.976 FPS, 100 ms a 10 FPS).</w:t>
+        <w:t>Procesando la misma cantidad de fotogramas, los FPS no cambian el costo: peatones.mp4 (10 FPS) y video.mp4 (23.976 FPS) tienen resolución parecida y tardaron parecido (0.068 s y 0.080 s); esa pequeña diferencia depende del contenido de cada video (lo que cuesta decodificarlo), no de los FPS. Donde los FPS sí influyen es en el costo por segundo de video: un segundo de video.mp4 tiene 9.1 millones de píxeles para procesar, frente a 4.4 millones en peatones.mp4. Para procesar en tiempo real hay que cumplir con el presupuesto de 1/FPS por fotograma (41.7 ms a 23.976 FPS, 100 ms a 10 FPS).</w:t>
       </w:r>
     </w:p>
     <w:p>
@@ -5359,7 +5455,7 @@
           <w:b w:val="0"/>
           <w:i w:val="0"/>
         </w:rPr>
-        <w:t>El costo de casi todas las operaciones por píxel crece con el número de píxeles (ancho × alto). En el reto, duplicar ancho y alto (4 veces los píxeles) aumentó el tiempo de 0.059 s a 0.186 s, y la conversión a gris pasó de 13.8 a 38.2 ms. A mayor resolución también aumentan la memoria y el tiempo de decodificación. Por eso es común reducir la resolución de los fotogramas antes de procesarlos cuando no se necesita tanto detalle.</w:t>
+        <w:t>El costo de casi todas las operaciones por píxel crece con el número de píxeles (ancho × alto). En el reto, duplicar ancho y alto (4 veces los píxeles) aumentó el tiempo de 0.080 s a 0.177 s, y la conversión a gris pasó de 16.6 a 39.0 ms. A mayor resolución también aumentan la memoria y el tiempo de decodificación. Por eso es común reducir la resolución de los fotogramas antes de procesarlos cuando no se necesita tanto detalle.</w:t>
       </w:r>
     </w:p>
     <w:p>
@@ -5456,6 +5552,9 @@
             <w:shd w:val="clear" w:color="auto" w:fill="1F3A5F"/>
           </w:tcPr>
           <w:p>
+            <w:pPr>
+              <w:keepNext/>
+            </w:pPr>
             <w:r/>
             <w:r>
               <w:rPr>
@@ -5473,6 +5572,9 @@
             <w:shd w:val="clear" w:color="auto" w:fill="1F3A5F"/>
           </w:tcPr>
           <w:p>
+            <w:pPr>
+              <w:keepNext/>
+            </w:pPr>
             <w:r/>
             <w:r>
               <w:rPr>

</xml_diff>